<commit_message>
fixed subbasin region generation for SST and GPI; ran region clustering by subbasins for GPI and SST anomalies (moving window) for June-October only
</commit_message>
<xml_diff>
--- a/plot log/Region generation plot log.docx
+++ b/plot log/Region generation plot log.docx
@@ -82,15 +82,7 @@
         </w:numPr>
       </w:pPr>
       <w:r>
-        <w:t xml:space="preserve">Anomaly calculated using the </w:t>
-      </w:r>
-      <w:proofErr w:type="spellStart"/>
-      <w:r>
-        <w:t>SST.mon.mean</w:t>
-      </w:r>
-      <w:proofErr w:type="spellEnd"/>
-      <w:r>
-        <w:t xml:space="preserve"> dataset (climatological mean calculated across the whole period</w:t>
+        <w:t>Anomaly calculated using the SST.mon.mean dataset (climatological mean calculated across the whole period</w:t>
       </w:r>
       <w:r>
         <w:t>, then subtracted from the monthly mean dataset)</w:t>
@@ -105,31 +97,7 @@
         </w:numPr>
       </w:pPr>
       <w:r>
-        <w:t>"C:\Research\Clean Repos\</w:t>
-      </w:r>
-      <w:proofErr w:type="spellStart"/>
-      <w:r>
-        <w:t>SyCLoPS</w:t>
-      </w:r>
-      <w:proofErr w:type="spellEnd"/>
-      <w:r>
-        <w:t xml:space="preserve"> copy\</w:t>
-      </w:r>
-      <w:proofErr w:type="spellStart"/>
-      <w:r>
-        <w:t>SyCLoPS</w:t>
-      </w:r>
-      <w:proofErr w:type="spellEnd"/>
-      <w:r>
-        <w:t>\images\</w:t>
-      </w:r>
-      <w:proofErr w:type="spellStart"/>
-      <w:r>
-        <w:t>region_generation</w:t>
-      </w:r>
-      <w:proofErr w:type="spellEnd"/>
-      <w:r>
-        <w:t>\SST_mon_mean_anom.png"</w:t>
+        <w:t>"C:\Research\Clean Repos\SyCLoPS copy\SyCLoPS\images\region_generation\SST_mon_mean_anom.png"</w:t>
       </w:r>
     </w:p>
     <w:p>
@@ -216,15 +184,7 @@
       </w:pPr>
       <w:r>
         <w:lastRenderedPageBreak/>
-        <w:t xml:space="preserve">Anomaly calculated using the SST </w:t>
-      </w:r>
-      <w:proofErr w:type="spellStart"/>
-      <w:r>
-        <w:t>ltmm</w:t>
-      </w:r>
-      <w:proofErr w:type="spellEnd"/>
-      <w:r>
-        <w:t xml:space="preserve"> dataset (climatological means calculated across the whole period, then subtracted from the monthly mean dataset) </w:t>
+        <w:t xml:space="preserve">Anomaly calculated using the SST ltmm dataset (climatological means calculated across the whole period, then subtracted from the monthly mean dataset) </w:t>
       </w:r>
     </w:p>
     <w:p>
@@ -236,15 +196,7 @@
         </w:numPr>
       </w:pPr>
       <w:r>
-        <w:t>"C:\Research\Clean Repos\</w:t>
-      </w:r>
-      <w:proofErr w:type="spellStart"/>
-      <w:r>
-        <w:t>SyCLoPS</w:t>
-      </w:r>
-      <w:proofErr w:type="spellEnd"/>
-      <w:r>
-        <w:t xml:space="preserve"> copy\SyCLoPS\images\region_generation\SST_mon_mean_anom_ltmm_v2.png"</w:t>
+        <w:t>"C:\Research\Clean Repos\SyCLoPS copy\SyCLoPS\images\region_generation\SST_mon_mean_anom_ltmm_v2.png"</w:t>
       </w:r>
     </w:p>
     <w:p>
@@ -354,15 +306,7 @@
         </w:numPr>
       </w:pPr>
       <w:r>
-        <w:t>"C:\Research\Clean Repos\</w:t>
-      </w:r>
-      <w:proofErr w:type="spellStart"/>
-      <w:r>
-        <w:t>SyCLoPS</w:t>
-      </w:r>
-      <w:proofErr w:type="spellEnd"/>
-      <w:r>
-        <w:t xml:space="preserve"> copy\SyCLoPS\images\region_generation\SST_mon_mean_anom_moving_window_v2.png"</w:t>
+        <w:t>"C:\Research\Clean Repos\SyCLoPS copy\SyCLoPS\images\region_generation\SST_mon_mean_anom_moving_window_v2.png"</w:t>
       </w:r>
     </w:p>
     <w:p>
@@ -373,6 +317,384 @@
           <w:numId w:val="1"/>
         </w:numPr>
       </w:pPr>
+      <w:r>
+        <w:t>GPI monthly mean anomaly</w:t>
+      </w:r>
+    </w:p>
+    <w:p>
+      <w:pPr>
+        <w:pStyle w:val="NormalWeb"/>
+        <w:numPr>
+          <w:ilvl w:val="1"/>
+          <w:numId w:val="1"/>
+        </w:numPr>
+      </w:pPr>
+      <w:r>
+        <w:rPr>
+          <w:noProof/>
+        </w:rPr>
+        <w:lastRenderedPageBreak/>
+        <w:drawing>
+          <wp:inline distT="0" distB="0" distL="0" distR="0" wp14:anchorId="196116C6" wp14:editId="7F276FB7">
+            <wp:extent cx="5943600" cy="3566160"/>
+            <wp:effectExtent l="0" t="0" r="0" b="0"/>
+            <wp:docPr id="77621316" name="Picture 5"/>
+            <wp:cNvGraphicFramePr>
+              <a:graphicFrameLocks xmlns:a="http://schemas.openxmlformats.org/drawingml/2006/main" noChangeAspect="1"/>
+            </wp:cNvGraphicFramePr>
+            <a:graphic xmlns:a="http://schemas.openxmlformats.org/drawingml/2006/main">
+              <a:graphicData uri="http://schemas.openxmlformats.org/drawingml/2006/picture">
+                <pic:pic xmlns:pic="http://schemas.openxmlformats.org/drawingml/2006/picture">
+                  <pic:nvPicPr>
+                    <pic:cNvPr id="0" name="Picture 12"/>
+                    <pic:cNvPicPr>
+                      <a:picLocks noChangeAspect="1" noChangeArrowheads="1"/>
+                    </pic:cNvPicPr>
+                  </pic:nvPicPr>
+                  <pic:blipFill>
+                    <a:blip r:embed="rId8">
+                      <a:extLst>
+                        <a:ext uri="{28A0092B-C50C-407E-A947-70E740481C1C}">
+                          <a14:useLocalDpi xmlns:a14="http://schemas.microsoft.com/office/drawing/2010/main" val="0"/>
+                        </a:ext>
+                      </a:extLst>
+                    </a:blip>
+                    <a:srcRect/>
+                    <a:stretch>
+                      <a:fillRect/>
+                    </a:stretch>
+                  </pic:blipFill>
+                  <pic:spPr bwMode="auto">
+                    <a:xfrm>
+                      <a:off x="0" y="0"/>
+                      <a:ext cx="5943600" cy="3566160"/>
+                    </a:xfrm>
+                    <a:prstGeom prst="rect">
+                      <a:avLst/>
+                    </a:prstGeom>
+                    <a:noFill/>
+                    <a:ln>
+                      <a:noFill/>
+                    </a:ln>
+                  </pic:spPr>
+                </pic:pic>
+              </a:graphicData>
+            </a:graphic>
+          </wp:inline>
+        </w:drawing>
+      </w:r>
+    </w:p>
+    <w:p>
+      <w:pPr>
+        <w:pStyle w:val="ListParagraph"/>
+        <w:numPr>
+          <w:ilvl w:val="1"/>
+          <w:numId w:val="1"/>
+        </w:numPr>
+      </w:pPr>
+      <w:r>
+        <w:t>Anomaly calculated using the GPI matlab dataset; calculated anomaly using monthly moving window mean for year n the range of the climatological mean is year – 10, year + 10.</w:t>
+      </w:r>
+    </w:p>
+    <w:p>
+      <w:pPr>
+        <w:pStyle w:val="ListParagraph"/>
+        <w:numPr>
+          <w:ilvl w:val="1"/>
+          <w:numId w:val="1"/>
+        </w:numPr>
+      </w:pPr>
+      <w:r>
+        <w:t>Native grid (0.25 deg)</w:t>
+      </w:r>
+    </w:p>
+    <w:p>
+      <w:pPr>
+        <w:pStyle w:val="ListParagraph"/>
+        <w:numPr>
+          <w:ilvl w:val="1"/>
+          <w:numId w:val="1"/>
+        </w:numPr>
+      </w:pPr>
+      <w:r>
+        <w:t>"C:\Research\Clean Repos\SyCLoPS copy\SyCLoPS\images\region_generation\GPI_mon_mean_anom_moving_window_0.25grid.png"</w:t>
+      </w:r>
+    </w:p>
+    <w:p>
+      <w:pPr>
+        <w:pStyle w:val="ListParagraph"/>
+      </w:pPr>
+    </w:p>
+    <w:p>
+      <w:pPr>
+        <w:pStyle w:val="ListParagraph"/>
+      </w:pPr>
+    </w:p>
+    <w:p>
+      <w:pPr>
+        <w:pStyle w:val="ListParagraph"/>
+      </w:pPr>
+    </w:p>
+    <w:p>
+      <w:pPr>
+        <w:pStyle w:val="ListParagraph"/>
+      </w:pPr>
+    </w:p>
+    <w:p>
+      <w:pPr>
+        <w:pStyle w:val="ListParagraph"/>
+      </w:pPr>
+    </w:p>
+    <w:p>
+      <w:pPr>
+        <w:pStyle w:val="ListParagraph"/>
+      </w:pPr>
+    </w:p>
+    <w:p>
+      <w:pPr>
+        <w:ind w:left="360"/>
+      </w:pPr>
+    </w:p>
+    <w:p>
+      <w:pPr>
+        <w:pStyle w:val="ListParagraph"/>
+      </w:pPr>
+    </w:p>
+    <w:p>
+      <w:pPr>
+        <w:pStyle w:val="ListParagraph"/>
+      </w:pPr>
+    </w:p>
+    <w:p>
+      <w:pPr>
+        <w:ind w:left="360"/>
+      </w:pPr>
+    </w:p>
+    <w:p>
+      <w:pPr>
+        <w:pStyle w:val="ListParagraph"/>
+      </w:pPr>
+    </w:p>
+    <w:p>
+      <w:pPr>
+        <w:ind w:left="360"/>
+      </w:pPr>
+    </w:p>
+    <w:p>
+      <w:pPr>
+        <w:pStyle w:val="ListParagraph"/>
+        <w:numPr>
+          <w:ilvl w:val="0"/>
+          <w:numId w:val="1"/>
+        </w:numPr>
+      </w:pPr>
+      <w:r>
+        <w:lastRenderedPageBreak/>
+        <w:t>GPI monthly mean anomaly</w:t>
+      </w:r>
+    </w:p>
+    <w:p>
+      <w:pPr>
+        <w:pStyle w:val="NormalWeb"/>
+        <w:numPr>
+          <w:ilvl w:val="1"/>
+          <w:numId w:val="1"/>
+        </w:numPr>
+      </w:pPr>
+      <w:r>
+        <w:rPr>
+          <w:noProof/>
+        </w:rPr>
+        <w:drawing>
+          <wp:inline distT="0" distB="0" distL="0" distR="0" wp14:anchorId="14EB8120" wp14:editId="6A8277B0">
+            <wp:extent cx="5943600" cy="3566160"/>
+            <wp:effectExtent l="0" t="0" r="0" b="0"/>
+            <wp:docPr id="1443028149" name="Picture 6"/>
+            <wp:cNvGraphicFramePr>
+              <a:graphicFrameLocks xmlns:a="http://schemas.openxmlformats.org/drawingml/2006/main" noChangeAspect="1"/>
+            </wp:cNvGraphicFramePr>
+            <a:graphic xmlns:a="http://schemas.openxmlformats.org/drawingml/2006/main">
+              <a:graphicData uri="http://schemas.openxmlformats.org/drawingml/2006/picture">
+                <pic:pic xmlns:pic="http://schemas.openxmlformats.org/drawingml/2006/picture">
+                  <pic:nvPicPr>
+                    <pic:cNvPr id="0" name="Picture 14"/>
+                    <pic:cNvPicPr>
+                      <a:picLocks noChangeAspect="1" noChangeArrowheads="1"/>
+                    </pic:cNvPicPr>
+                  </pic:nvPicPr>
+                  <pic:blipFill>
+                    <a:blip r:embed="rId9">
+                      <a:extLst>
+                        <a:ext uri="{28A0092B-C50C-407E-A947-70E740481C1C}">
+                          <a14:useLocalDpi xmlns:a14="http://schemas.microsoft.com/office/drawing/2010/main" val="0"/>
+                        </a:ext>
+                      </a:extLst>
+                    </a:blip>
+                    <a:srcRect/>
+                    <a:stretch>
+                      <a:fillRect/>
+                    </a:stretch>
+                  </pic:blipFill>
+                  <pic:spPr bwMode="auto">
+                    <a:xfrm>
+                      <a:off x="0" y="0"/>
+                      <a:ext cx="5943600" cy="3566160"/>
+                    </a:xfrm>
+                    <a:prstGeom prst="rect">
+                      <a:avLst/>
+                    </a:prstGeom>
+                    <a:noFill/>
+                    <a:ln>
+                      <a:noFill/>
+                    </a:ln>
+                  </pic:spPr>
+                </pic:pic>
+              </a:graphicData>
+            </a:graphic>
+          </wp:inline>
+        </w:drawing>
+      </w:r>
+    </w:p>
+    <w:p>
+      <w:pPr>
+        <w:pStyle w:val="ListParagraph"/>
+        <w:numPr>
+          <w:ilvl w:val="1"/>
+          <w:numId w:val="1"/>
+        </w:numPr>
+      </w:pPr>
+      <w:r>
+        <w:t>Anomaly calculated using the GPI matlab dataset; calculated anomaly using monthly moving window mean for year n the range of the climatological mean is year – 10, year + 10.</w:t>
+      </w:r>
+    </w:p>
+    <w:p>
+      <w:pPr>
+        <w:pStyle w:val="ListParagraph"/>
+        <w:numPr>
+          <w:ilvl w:val="1"/>
+          <w:numId w:val="1"/>
+        </w:numPr>
+      </w:pPr>
+      <w:r>
+        <w:t>1 deg grid</w:t>
+      </w:r>
+    </w:p>
+    <w:p>
+      <w:pPr>
+        <w:pStyle w:val="ListParagraph"/>
+        <w:numPr>
+          <w:ilvl w:val="1"/>
+          <w:numId w:val="1"/>
+        </w:numPr>
+      </w:pPr>
+      <w:r>
+        <w:t>"C:\Research\Clean Repos\SyCLoPS copy\SyCLoPS\images\region_generation\GPI_mon_mean_anom_moving_window_1deggrid.png"</w:t>
+      </w:r>
+    </w:p>
+    <w:p>
+      <w:pPr>
+        <w:pStyle w:val="ListParagraph"/>
+        <w:numPr>
+          <w:ilvl w:val="0"/>
+          <w:numId w:val="1"/>
+        </w:numPr>
+      </w:pPr>
+      <w:r>
+        <w:t>GPI monthly mean anomaly (moving window) June-October</w:t>
+      </w:r>
+    </w:p>
+    <w:p>
+      <w:pPr>
+        <w:pStyle w:val="ListParagraph"/>
+        <w:numPr>
+          <w:ilvl w:val="1"/>
+          <w:numId w:val="1"/>
+        </w:numPr>
+      </w:pPr>
+      <w:r>
+        <w:t>Anomaly calculated using the GPI matlab dataset; calculated anomaly using monthly moving window mean for year n the range of the climatological mean is year – 10, year + 10.</w:t>
+      </w:r>
+    </w:p>
+    <w:p>
+      <w:pPr>
+        <w:pStyle w:val="ListParagraph"/>
+        <w:numPr>
+          <w:ilvl w:val="1"/>
+          <w:numId w:val="1"/>
+        </w:numPr>
+      </w:pPr>
+      <w:r>
+        <w:t>1 deg grid</w:t>
+      </w:r>
+    </w:p>
+    <w:p>
+      <w:pPr>
+        <w:pStyle w:val="ListParagraph"/>
+        <w:numPr>
+          <w:ilvl w:val="1"/>
+          <w:numId w:val="1"/>
+        </w:numPr>
+      </w:pPr>
+      <w:r>
+        <w:t>"C:\Research\Clean Repos\SyCLoPS copy\SyCLoPS\images\region_generation\GPI_mon_mean_anom_moving_wind</w:t>
+      </w:r>
+      <w:r>
+        <w:lastRenderedPageBreak/>
+        <w:t>ow_1deg_jun_oct_grid.png"</w:t>
+      </w:r>
+      <w:r>
+        <w:rPr>
+          <w:noProof/>
+        </w:rPr>
+        <w:drawing>
+          <wp:inline distT="0" distB="0" distL="0" distR="0" wp14:anchorId="2F27AF3E" wp14:editId="3A59E22E">
+            <wp:extent cx="5943600" cy="2971800"/>
+            <wp:effectExtent l="0" t="0" r="0" b="0"/>
+            <wp:docPr id="514851000" name="Picture 2"/>
+            <wp:cNvGraphicFramePr>
+              <a:graphicFrameLocks xmlns:a="http://schemas.openxmlformats.org/drawingml/2006/main" noChangeAspect="1"/>
+            </wp:cNvGraphicFramePr>
+            <a:graphic xmlns:a="http://schemas.openxmlformats.org/drawingml/2006/main">
+              <a:graphicData uri="http://schemas.openxmlformats.org/drawingml/2006/picture">
+                <pic:pic xmlns:pic="http://schemas.openxmlformats.org/drawingml/2006/picture">
+                  <pic:nvPicPr>
+                    <pic:cNvPr id="0" name="Picture 6"/>
+                    <pic:cNvPicPr>
+                      <a:picLocks noChangeAspect="1" noChangeArrowheads="1"/>
+                    </pic:cNvPicPr>
+                  </pic:nvPicPr>
+                  <pic:blipFill>
+                    <a:blip r:embed="rId10">
+                      <a:extLst>
+                        <a:ext uri="{28A0092B-C50C-407E-A947-70E740481C1C}">
+                          <a14:useLocalDpi xmlns:a14="http://schemas.microsoft.com/office/drawing/2010/main" val="0"/>
+                        </a:ext>
+                      </a:extLst>
+                    </a:blip>
+                    <a:srcRect/>
+                    <a:stretch>
+                      <a:fillRect/>
+                    </a:stretch>
+                  </pic:blipFill>
+                  <pic:spPr bwMode="auto">
+                    <a:xfrm>
+                      <a:off x="0" y="0"/>
+                      <a:ext cx="5943600" cy="2971800"/>
+                    </a:xfrm>
+                    <a:prstGeom prst="rect">
+                      <a:avLst/>
+                    </a:prstGeom>
+                    <a:noFill/>
+                    <a:ln>
+                      <a:noFill/>
+                    </a:ln>
+                  </pic:spPr>
+                </pic:pic>
+              </a:graphicData>
+            </a:graphic>
+          </wp:inline>
+        </w:drawing>
+      </w:r>
     </w:p>
     <w:sectPr>
       <w:pgSz w:w="12240" w:h="15840"/>
@@ -1443,7 +1765,6 @@
     <w:name w:val="Normal (Web)"/>
     <w:basedOn w:val="Normal"/>
     <w:uiPriority w:val="99"/>
-    <w:semiHidden/>
     <w:unhideWhenUsed/>
     <w:rsid w:val="004E2296"/>
     <w:pPr>

</xml_diff>

<commit_message>
commit before migration to Mac from Windows
</commit_message>
<xml_diff>
--- a/plot log/Region generation plot log.docx
+++ b/plot log/Region generation plot log.docx
@@ -636,11 +636,56 @@
         </w:numPr>
       </w:pPr>
       <w:r>
-        <w:t>"C:\Research\Clean Repos\SyCLoPS copy\SyCLoPS\images\region_generation\GPI_mon_mean_anom_moving_wind</w:t>
-      </w:r>
+        <w:t>"C:\Research\Clean Repos\SyCLoPS copy\SyCLoPS\images\region_generation\GPI_mon_mean_anom_moving_window_1deg_jun_oct_grid.png"</w:t>
+      </w:r>
+    </w:p>
+    <w:p>
+      <w:pPr>
+        <w:pStyle w:val="ListParagraph"/>
+        <w:numPr>
+          <w:ilvl w:val="1"/>
+          <w:numId w:val="1"/>
+        </w:numPr>
+      </w:pPr>
+    </w:p>
+    <w:p>
+      <w:pPr>
+        <w:pStyle w:val="ListParagraph"/>
+        <w:numPr>
+          <w:ilvl w:val="1"/>
+          <w:numId w:val="1"/>
+        </w:numPr>
+      </w:pPr>
+    </w:p>
+    <w:p>
+      <w:pPr>
+        <w:pStyle w:val="ListParagraph"/>
+        <w:numPr>
+          <w:ilvl w:val="1"/>
+          <w:numId w:val="1"/>
+        </w:numPr>
+      </w:pPr>
+    </w:p>
+    <w:p>
+      <w:pPr>
+        <w:pStyle w:val="ListParagraph"/>
+        <w:numPr>
+          <w:ilvl w:val="1"/>
+          <w:numId w:val="1"/>
+        </w:numPr>
+      </w:pPr>
+    </w:p>
+    <w:p>
+      <w:pPr>
+        <w:pStyle w:val="ListParagraph"/>
+        <w:numPr>
+          <w:ilvl w:val="0"/>
+          <w:numId w:val="1"/>
+        </w:numPr>
+      </w:pPr>
       <w:r>
         <w:lastRenderedPageBreak/>
-        <w:t>ow_1deg_jun_oct_grid.png"</w:t>
+        <w:t>SS</w:t>
       </w:r>
       <w:r>
         <w:rPr>
@@ -711,7 +756,7 @@
   <w:abstractNum w:abstractNumId="0" w15:restartNumberingAfterBreak="0">
     <w:nsid w:val="747A38EE"/>
     <w:multiLevelType w:val="hybridMultilevel"/>
-    <w:tmpl w:val="ADD66F3E"/>
+    <w:tmpl w:val="AF9A3CD6"/>
     <w:lvl w:ilvl="0" w:tplc="96362A36">
       <w:numFmt w:val="bullet"/>
       <w:lvlText w:val="-"/>
@@ -735,7 +780,7 @@
         <w:rFonts w:ascii="Courier New" w:hAnsi="Courier New" w:cs="Courier New" w:hint="default"/>
       </w:rPr>
     </w:lvl>
-    <w:lvl w:ilvl="2" w:tplc="04090005" w:tentative="1">
+    <w:lvl w:ilvl="2" w:tplc="04090005">
       <w:start w:val="1"/>
       <w:numFmt w:val="bullet"/>
       <w:lvlText w:val=""/>

</xml_diff>